<commit_message>
Switch analyzer: stack topology export and LLDP link consistency check
</commit_message>
<xml_diff>
--- a/docs/switch-config-parser-guide.docx
+++ b/docs/switch-config-parser-guide.docx
@@ -2792,6 +2792,22 @@
     </w:p>
     <w:p>
       <w:pPr>
+        <w:pStyle w:val="ListBullet"/>
+      </w:pPr>
+      <w:r>
+        <w:t>2026-10-07 堆疊頁（IRF、StackWise、VSF、Virtual Chassis、Alcatel／Extreme／Ruckus ICX 堆疊等）的「匯出 SVG」旁新增 draw.io 與 Mermaid 下載，可放進文件後再修改；成員依畫面上的順序相連，有記錄堆疊埠時標在連線上。</w:t>
+      </w:r>
+    </w:p>
+    <w:p>
+      <w:pPr>
+        <w:pStyle w:val="ListBullet"/>
+      </w:pPr>
+      <w:r>
+        <w:t>2026-10-08 LLDP 多設備檢視新增「鏈路兩端設定一致性」：把相鄰交換器的設定檔一起加入後，會依 LLDP 找出兩端都已載入的鏈路，列出兩端模式不同（access／trunk）、access VLAN 不同、trunk 允許的 VLAN 不一致（列出各自多的 VLAN）、native VLAN 不同，以及只有一端在聚合（LAG）內的情況，方便找出 VLAN 不通的原因。LLDP 回報的埠名若對不到設定檔中的介面，會計數但不判斷。</w:t>
+      </w:r>
+    </w:p>
+    <w:p>
+      <w:pPr>
         <w:pStyle w:val="Heading1"/>
       </w:pPr>
       <w:r>

</xml_diff>